<commit_message>
docs: propuesta NO-FIT-011 Solicitud de equipo de cómputo (equipo de área y estaciones compartidas)
Co-Authored-By: Claude Opus 5.5 <noreply@anthropic.com>
Claude-Session: https://claude.ai/code/session_01XRB1wz51wcF3Yrg4VK8DGc
</commit_message>
<xml_diff>
--- a/revision-2026/word/NO-FIT-001 Solicitud de Alta de Usuario.docx
+++ b/revision-2026/word/NO-FIT-001 Solicitud de Alta de Usuario.docx
@@ -599,6 +599,16 @@
             </w:r>
             <w:r>
               <w:t xml:space="preserve">Usará la estación compartida de: ______</w:t>
+            </w:r>
+            <w:r>
+              <w:t xml:space="preserve"> </w:t>
+            </w:r>
+            <w:r>
+              <w:rPr>
+                <w:i/>
+                <w:iCs/>
+              </w:rPr>
+              <w:t xml:space="preserve">(si la estación no existe, se pide con NO-FIT-011)</w:t>
             </w:r>
           </w:p>
         </w:tc>

</xml_diff>